<commit_message>
Added google analytics tags
</commit_message>
<xml_diff>
--- a/Cafe_Menu.docx
+++ b/Cafe_Menu.docx
@@ -18,7 +18,7 @@
           <w:noProof/>
         </w:rPr>
         <w:drawing>
-          <wp:anchor distT="0" distB="0" distL="114300" distR="114300" simplePos="0" relativeHeight="251658240" behindDoc="0" locked="0" layoutInCell="1" allowOverlap="1" wp14:anchorId="0B4C3279" wp14:editId="5FB1BEF5">
+          <wp:anchor distT="0" distB="0" distL="114300" distR="114300" simplePos="0" relativeHeight="251658240" behindDoc="0" locked="0" layoutInCell="1" allowOverlap="1" wp14:anchorId="0B4C3279" wp14:editId="6C3CD9CE">
             <wp:simplePos x="0" y="0"/>
             <wp:positionH relativeFrom="margin">
               <wp:posOffset>-348284</wp:posOffset>
@@ -897,8 +897,18 @@
                 <w:sz w:val="16"/>
                 <w:szCs w:val="16"/>
               </w:rPr>
-              <w:t>…………………………………..</w:t>
-            </w:r>
+              <w:t>………………………………</w:t>
+            </w:r>
+            <w:proofErr w:type="gramStart"/>
+            <w:r>
+              <w:rPr>
+                <w:color w:val="auto"/>
+                <w:sz w:val="16"/>
+                <w:szCs w:val="16"/>
+              </w:rPr>
+              <w:t>…..</w:t>
+            </w:r>
+            <w:proofErr w:type="gramEnd"/>
             <w:r>
               <w:rPr>
                 <w:color w:val="auto"/>
@@ -953,14 +963,24 @@
                 <w:sz w:val="16"/>
                 <w:szCs w:val="16"/>
               </w:rPr>
-              <w:t>…………………………………..</w:t>
-            </w:r>
+              <w:t>………………………………</w:t>
+            </w:r>
+            <w:proofErr w:type="gramStart"/>
             <w:r>
               <w:rPr>
                 <w:color w:val="auto"/>
                 <w:sz w:val="16"/>
                 <w:szCs w:val="16"/>
               </w:rPr>
+              <w:t>…..</w:t>
+            </w:r>
+            <w:proofErr w:type="gramEnd"/>
+            <w:r>
+              <w:rPr>
+                <w:color w:val="auto"/>
+                <w:sz w:val="16"/>
+                <w:szCs w:val="16"/>
+              </w:rPr>
               <w:t xml:space="preserve"> </w:t>
             </w:r>
             <w:r>
@@ -1009,8 +1029,18 @@
                 <w:sz w:val="16"/>
                 <w:szCs w:val="16"/>
               </w:rPr>
-              <w:t>…………………………………..</w:t>
-            </w:r>
+              <w:t>………………………………</w:t>
+            </w:r>
+            <w:proofErr w:type="gramStart"/>
+            <w:r>
+              <w:rPr>
+                <w:color w:val="auto"/>
+                <w:sz w:val="16"/>
+                <w:szCs w:val="16"/>
+              </w:rPr>
+              <w:t>…..</w:t>
+            </w:r>
+            <w:proofErr w:type="gramEnd"/>
             <w:r>
               <w:rPr>
                 <w:color w:val="auto"/>
@@ -1084,7 +1114,16 @@
                 <w:sz w:val="18"/>
                 <w:szCs w:val="18"/>
               </w:rPr>
-              <w:t xml:space="preserve">p            </w:t>
+              <w:t xml:space="preserve">p          </w:t>
+            </w:r>
+            <w:proofErr w:type="gramStart"/>
+            <w:r>
+              <w:rPr>
+                <w:color w:val="auto"/>
+                <w:sz w:val="18"/>
+                <w:szCs w:val="18"/>
+              </w:rPr>
+              <w:t xml:space="preserve">  </w:t>
             </w:r>
             <w:r>
               <w:rPr>
@@ -1094,6 +1133,7 @@
               </w:rPr>
               <w:t>.</w:t>
             </w:r>
+            <w:proofErr w:type="gramEnd"/>
             <w:r>
               <w:rPr>
                 <w:color w:val="auto"/>
@@ -1239,7 +1279,16 @@
                 <w:sz w:val="18"/>
                 <w:szCs w:val="18"/>
               </w:rPr>
-              <w:t xml:space="preserve">                </w:t>
+              <w:t xml:space="preserve">              </w:t>
+            </w:r>
+            <w:proofErr w:type="gramStart"/>
+            <w:r>
+              <w:rPr>
+                <w:color w:val="auto"/>
+                <w:sz w:val="18"/>
+                <w:szCs w:val="18"/>
+              </w:rPr>
+              <w:t xml:space="preserve">  </w:t>
             </w:r>
             <w:r>
               <w:rPr>
@@ -1249,6 +1298,7 @@
               </w:rPr>
               <w:t>.</w:t>
             </w:r>
+            <w:proofErr w:type="gramEnd"/>
             <w:r>
               <w:rPr>
                 <w:color w:val="auto"/>
@@ -1383,7 +1433,16 @@
                 <w:sz w:val="16"/>
                 <w:szCs w:val="16"/>
               </w:rPr>
-              <w:t>……….</w:t>
+              <w:t>……</w:t>
+            </w:r>
+            <w:proofErr w:type="gramStart"/>
+            <w:r>
+              <w:rPr>
+                <w:color w:val="auto"/>
+                <w:sz w:val="16"/>
+                <w:szCs w:val="16"/>
+              </w:rPr>
+              <w:t>….</w:t>
             </w:r>
             <w:r>
               <w:rPr>
@@ -1393,6 +1452,7 @@
               </w:rPr>
               <w:t xml:space="preserve">   </w:t>
             </w:r>
+            <w:proofErr w:type="gramEnd"/>
             <w:r>
               <w:rPr>
                 <w:color w:val="FFFFFF" w:themeColor="background1"/>
@@ -1407,7 +1467,16 @@
                 <w:sz w:val="18"/>
                 <w:szCs w:val="18"/>
               </w:rPr>
-              <w:t xml:space="preserve"> 80p                  </w:t>
+              <w:t xml:space="preserve"> 80p                </w:t>
+            </w:r>
+            <w:proofErr w:type="gramStart"/>
+            <w:r>
+              <w:rPr>
+                <w:color w:val="auto"/>
+                <w:sz w:val="18"/>
+                <w:szCs w:val="18"/>
+              </w:rPr>
+              <w:t xml:space="preserve">  </w:t>
             </w:r>
             <w:r>
               <w:rPr>
@@ -1417,6 +1486,7 @@
               </w:rPr>
               <w:t>.</w:t>
             </w:r>
+            <w:proofErr w:type="gramEnd"/>
             <w:r>
               <w:rPr>
                 <w:color w:val="auto"/>

</xml_diff>